<commit_message>
v2.9: v4 expert-panel review fixes - all 7 Major resolved (Abstract borderline qualifier, multi-k claim lowered after pooled n=57 analysis (d=-0.17, p=0.19, CI crosses 0), fish result reframed as community-benchmark ceiling, Discussion n=500/1000 SD+d corrected from source data, L3 L=1000bp protocol motivation, storage disclosure precisionized) + Crossref-audited reference corrections (7 wrong DOIs fixed: refs 5/6/8/11/25/26/27; ref 7 authors; 15 refs full author lists) + all Minor items; verified by independent v4-verifier (review_v4_verify.md, all Major CLOSED); package v2.9 + repro_package v1.7
</commit_message>
<xml_diff>
--- a/tables_pdf/All_Tables.docx
+++ b/tables_pdf/All_Tables.docx
@@ -477,7 +477,7 @@
         <w:t xml:space="preserve"> </w:t>
       </w:r>
       <w:r>
-        <w:t xml:space="preserve">† The n=1000 indel row is FT2-relative (Fusang tree vs FastTree2 tree; TRUE-tree comparison not available at this scale) and is therefore not comparable with TRUE-relative values elsewhere. The Abstract reports the independent 112-seed post-exclusion benchmark value (nRF=0.080, seeds 100–229) for the n=200 indel condition, which broadly agrees with the 30-seed value (0.077). That 112-seed benchmark (n=200, indel rate=0.02) achieved p=0.052 (paired Wilcoxon signed-rank test on TRUE-relative nRF). After Bonferroni correction across 5 ground truth datasets (α=0.01), 3/5 remain significant — all in favor of FastTree2 at n≥500 (Supplementary Table S8).</w:t>
+        <w:t xml:space="preserve">† The n=1000 indel row is FT2-relative (Fusang tree vs FastTree2 tree; true-tree comparison not available at this scale) and is therefore not comparable with TRUE-relative values elsewhere. The Abstract reports the independent 112-seed post-exclusion benchmark value (nRF=0.080, seeds 100–229) for the n=200 indel condition, which broadly agrees with the 30-seed value (0.077). That 112-seed benchmark (n=200, indel rate=0.02) achieved p=0.052 (paired Wilcoxon signed-rank test on TRUE-relative nRF). After Bonferroni correction across 5 ground truth datasets (α=0.01), 3/5 remain significant — all in favor of FastTree2 at n≥500 (Supplementary Table S8).</w:t>
       </w:r>
     </w:p>
     <w:p>
@@ -498,7 +498,7 @@
         <w:t xml:space="preserve">zero sequence alignment</w:t>
       </w:r>
       <w:r>
-        <w:t xml:space="preserve">, operating directly on raw FASTA sequences. The multi-k ensemble variant (see below) provides a statistically significant improvement over the default configuration. On clean data at n≥500, MSA-based methods retain a clear advantage (p&lt;0.001 after correction), indicating that full positional information from alignment benefits ML inference when indels are absent.</w:t>
+        <w:t xml:space="preserve">, operating directly on raw FASTA sequences. The multi-k ensemble variant (see below) provides accuracy comparable to the best single-k configuration without manual k selection (its improvement over the default spaced configuration is seed-set-dependent; see the Multi-k section). On clean data at n≥500, MSA-based methods retain a clear advantage (p&lt;0.001 after correction), indicating that full positional information from alignment benefits ML inference when indels are absent.</w:t>
       </w:r>
     </w:p>
     <w:p>
@@ -510,7 +510,7 @@
           <w:b/>
           <w:bCs/>
         </w:rPr>
-        <w:t xml:space="preserve">Table 2. Spaced k-mer vs MinHash robustness (n=200, vs TRUE tree).</w:t>
+        <w:t xml:space="preserve">Table 2. Spaced k-mer vs MinHash robustness (n=200, vs true tree).</w:t>
       </w:r>
     </w:p>
     <w:tbl>
@@ -914,7 +914,7 @@
         <w:pStyle w:val="BodyText"/>
       </w:pPr>
       <w:r>
-        <w:t xml:space="preserve">Three findings emerge from the multi-seed Mash benchmark (n=30, Mash v2.3, k=21, MinHash Jaccard, NJ tree, vs TRUE tree):</w:t>
+        <w:t xml:space="preserve">Three findings emerge from the multi-seed Mash benchmark (n=30, Mash v2.3, k=21, MinHash Jaccard, NJ tree, vs true tree):</w:t>
       </w:r>
     </w:p>
     <w:p>
@@ -1674,7 +1674,7 @@
         <w:t xml:space="preserve"> </w:t>
       </w:r>
       <w:r>
-        <w:t xml:space="preserve">- Cohen’s d (vs default spaced) = 0.54 (medium effect size; note that this value lies near the conventional boundary of medium effect at d=0.50, and the bootstrap 95% CI likely crosses into the small-to-medium range)</w:t>
+        <w:t xml:space="preserve">- Cohen’s d (vs default spaced) = −0.53 (medium effect size, negative favoring the ensemble; note that this value lies near the conventional boundary of medium effect at |d|=0.50, and the bootstrap 95% CI likely crosses into the small-to-medium range)</w:t>
       </w:r>
     </w:p>
     <w:p>
@@ -1697,7 +1697,7 @@
         <w:t xml:space="preserve"> </w:t>
       </w:r>
       <w:r>
-        <w:t xml:space="preserve">flag.</w:t>
+        <w:t xml:space="preserve">flag. The ensemble-vs-default comparison is not stable across seed sets; a pooled analysis across both available seed sets is reported in the competitor comparison section below.</w:t>
       </w:r>
     </w:p>
     <w:p>
@@ -1709,7 +1709,7 @@
           <w:b/>
           <w:bCs/>
         </w:rPr>
-        <w:t xml:space="preserve">Table 5. Pipeline-level validation against TRUE tree (n=200, L=1000 bp, sub=0.05, indel=0.02, 30 seeds, all levels complete). All nRF values are TRUE-relative (vs simulated coalescent ground truth). Note: this benchmark uses a coalescent simulation protocol with L=1000 bp, independent of the guide-tree protocol used in Tables 1 and 3 (L=500 bp); absolute nRF values are higher for all methods under this protocol and are not directly comparable across benchmarks. Per-seed data: Supplementary Table S13.</w:t>
+        <w:t xml:space="preserve">Table 5. Pipeline-level validation against true tree (n=200, L=1000 bp, sub=0.05, indel=0.02, 30 seeds, all levels complete). All nRF values are TRUE-relative (vs simulated coalescent ground truth). Note: this benchmark uses a coalescent simulation protocol with L=1000 bp, independent of the guide-tree protocol used in Tables 1 and 3 (L=500 bp); absolute nRF values are higher for all methods under this protocol and are not directly comparable across benchmarks. Per-seed data: Supplementary Table S13.</w:t>
       </w:r>
     </w:p>
     <w:tbl>
@@ -2050,7 +2050,7 @@
         <w:pStyle w:val="BodyText"/>
       </w:pPr>
       <w:r>
-        <w:t xml:space="preserve">nRF=0: perfect match; nRF=1.0: random tree. nRF = RF / (2(n−3)). All values vs TRUE coalescent tree. L0 and L1 complete across all 30 seeds; L3 complete across all 30 seeds on Linux. L1 vs L0: Wilcoxon signed-rank test p&lt;0.0001, paired Cohen’s d=3.82 (large effect).</w:t>
+        <w:t xml:space="preserve">nRF=0: perfect match; nRF=1.0: random tree. nRF = RF / (2(n−3)). All values vs true coalescent tree. L0 and L1 complete across all 30 seeds; L3 complete across all 30 seeds on Linux. L1 vs L0: Wilcoxon signed-rank test p&lt;0.0001, paired Cohen’s d=3.82 (large effect).</w:t>
       </w:r>
     </w:p>
     <w:p>
@@ -2097,7 +2097,7 @@
         <w:t xml:space="preserve">Multi-k fusion provides a 21.5% relative accuracy improvement over single-k</w:t>
       </w:r>
       <w:r>
-        <w:t xml:space="preserve">, reducing nRF from 0.743 to 0.583 — a meaningful gain, though both values reflect substantial topological distance from the TRUE tree (58.3% of bipartitions differ). L1 (nRF=0.583) substantially outperforms L0 (nRF=0.743, p&lt;0.0001, paired d=3.82). The unusually large effect size (paired d=3.82) reflects that single-k (L0) operates near the information ceiling of a single k-mer resolution under heavy indels — the high baseline nRF (0.743) and low variance (σ=0.046 for L0, σ=0.044 for L1) combine to yield d=3.82, indicating that most of the gain comes from resolving splits that are nearly random for single-k but recoverable with multi-scale k-mer information. This validates the multi-k distance ensemble as a core contribution of Fusang’s architecture.</w:t>
+        <w:t xml:space="preserve">, reducing nRF from 0.743 to 0.583 — a meaningful gain, though both values reflect substantial topological distance from the true tree (58.3% of bipartitions differ). L1 (nRF=0.583) substantially outperforms L0 (nRF=0.743, p&lt;0.0001, paired d=3.82). The unusually large effect size (paired d=3.82) reflects that single-k (L0) operates near the information ceiling of a single k-mer resolution under heavy indels — the high baseline nRF (0.743) and low variance (σ=0.046 for L0, σ=0.044 for L1) combine to yield d=3.82, indicating that most of the gain comes from resolving splits that are nearly random for single-k but recoverable with multi-scale k-mer information. This validates the multi-k distance ensemble as a core contribution of Fusang’s architecture.</w:t>
       </w:r>
     </w:p>
     <w:p>
@@ -2105,7 +2105,7 @@
         <w:pStyle w:val="FirstParagraph"/>
       </w:pPr>
       <w:r>
-        <w:t xml:space="preserve">These results position the multi-k ensemble NJ as a practical alternative to MSA+ML for indel-rich datasets at moderate scales. The trade-off is notable: L1 requires no alignment step and completes in ~15 seconds per seed (vs ~31 seconds for L3 in the same Linux environment, a 2× speedup that grows further at larger scales where MSA cost dominates). Both methods remain substantially distant from the TRUE tree under this deliberately harsh coalescent protocol (nRF≈0.58–0.60), so the practical takeaway is comparable-topology-at-far-lower-cost rather than high absolute accuracy. The L1≈L3 agreement is consistent with the broader pattern of k-mer methods matching MSA accuracy under indels (Tables 1, 3, 4).</w:t>
+        <w:t xml:space="preserve">These results position the multi-k ensemble NJ as a practical alternative to MSA+ML for indel-rich datasets at moderate scales. The trade-off is notable: L1 requires no alignment step and completes in ~15 seconds per seed (vs ~31 seconds for L3 in the same Linux environment, a 2× speedup that grows further at larger scales where MSA cost dominates). Both methods remain substantially distant from the true tree under this deliberately harsh coalescent protocol (nRF≈0.58–0.60), so the practical takeaway is comparable-topology-at-far-lower-cost rather than high absolute accuracy. The L1≈L3 agreement is consistent with the broader pattern of k-mer methods matching MSA accuracy under indels (Tables 1, 3, 4).</w:t>
       </w:r>
     </w:p>
     <w:p>
@@ -3071,7 +3071,7 @@
         <w:t xml:space="preserve"> </w:t>
       </w:r>
       <w:r>
-        <w:t xml:space="preserve">Co-phylog’s context-object approach (k=19) produces substantially worse trees (mean nRF=0.408, 3.8× worse than Fusang, p=5.6×10⁻⁶) on indel-rich data. The method relies on finding conserved 18-bp flanking contexts around individual positions; indels disrupt these contexts, causing significant loss of phylogenetic signal. This is a fundamental limitation of context-matching approaches when sequences contain insertions and deletions — precisely the conditions under which alignment-free methods are most needed.</w:t>
+        <w:t xml:space="preserve">Co-phylog’s context-object approach (k=19) produces substantially worse trees (mean nRF=0.408, 3.8× worse than Fusang, p=5.6×10⁻⁶) on indel-rich data. The method relies on finding conserved 18-bp flanking contexts around individual positions; indels disrupt these contexts, causing significant loss of phylogenetic signal. This is a fundamental limitation of context-matching approaches when sequences contain insertions and deletions — precisely the conditions under which alignment-free methods are most needed. (Co-phylog results are from our Python reimplementation, Supplementary Note S4; on the fish benchmark — see Real genome benchmarks below — the reimplementation slightly exceeds the published configuration’s accuracy, indicating the reimplementation is not disadvantaged relative to the original; the DNA conclusion here is therefore conservative in direction.)</w:t>
       </w:r>
     </w:p>
     <w:p>
@@ -3107,18 +3107,36 @@
           <w:b/>
           <w:bCs/>
         </w:rPr>
-        <w:t xml:space="preserve">Simple k-mer cosine distances achieve accuracy statistically indistinguishable from spaced k-mers.</w:t>
+        <w:t xml:space="preserve">Simple k-mer cosine distances show no significant difference from spaced k-mers.</w:t>
       </w:r>
       <w:r>
         <w:t xml:space="preserve"> </w:t>
       </w:r>
       <w:r>
-        <w:t xml:space="preserve">Standard contiguous k-mer cosine distance (k=5 or k=7) achieves nRF≈0.10–0.11, statistically indistinguishable from Fusang’s spaced k-mer configuration (k=5: 0.104 vs 0.108, p=0.26, paired d=−0.21). This indicates that at the tested indel rate (0.02), the spaced k-mer gap pattern provides no measurable advantage over contiguous k-mers on this DNA benchmark — consistent with the protein-domain result (p=0.31; see Cross-domain validation below). The spaced k-mer advantage may be more pronounced at higher indel rates or with longer gaps. On this 27-seed competitor seed set the multi-k ensemble is likewise statistically indistinguishable from the default spaced configuration (0.111 vs 0.108, p=0.30); the ensemble’s significant improvement over the default is established on the pre-specified 30-seed benchmark (Table 4, seed set 230–259, p=0.006).</w:t>
+        <w:t xml:space="preserve">Standard contiguous k-mer cosine distance (k=5 or k=7) achieves nRF≈0.10–0.11, with no significant difference from Fusang’s spaced k-mer configuration (k=5: 0.104 vs 0.108, p=0.26, paired d=−0.21). With n=27, power to detect a medium effect (d=0.5) is approximately 0.73, so equivalence should not be inferred from the non-significant result. At the tested indel rate (0.02), the spaced k-mer gap pattern provides no detected advantage over contiguous k-mers on this DNA benchmark — consistent with the protein-domain result (p=0.31; see Cross-domain validation below). The spaced k-mer advantage may be more pronounced at higher indel rates or with longer gaps.</w:t>
       </w:r>
     </w:p>
     <w:p>
       <w:pPr>
         <w:pStyle w:val="FirstParagraph"/>
+      </w:pPr>
+      <w:r>
+        <w:rPr>
+          <w:b/>
+          <w:bCs/>
+        </w:rPr>
+        <w:t xml:space="preserve">Reproducibility of the ensemble effect across seed sets.</w:t>
+      </w:r>
+      <w:r>
+        <w:t xml:space="preserve"> </w:t>
+      </w:r>
+      <w:r>
+        <w:t xml:space="preserve">On this 27-seed seed set the multi-k ensemble is likewise statistically indistinguishable from the default spaced configuration (0.111 vs 0.108, paired d=+0.22, p=0.30) — the opposite sign from the 30-seed benchmark of Table 4 (d=−0.53, p=0.006; heterogeneity between the two seed sets’ effect sizes: z≈−2.8, p≈0.005). Pooling all 57 seeds from both sets, the ensemble-vs-default difference is not significant (mean per-seed difference −0.003, paired d=−0.17, 95% CI [−0.45, 0.09], Wilcoxon p=0.19; ensemble wins 32/57). We therefore do not claim a general accuracy advantage of the multi-k ensemble over the default spaced configuration at L=500 bp. The ensemble’s established benefits are (i) the large single-k→multi-k gain under the L=1000 bp coalescent protocol (Table 5, d=3.82, p&lt;0.0001) and (ii) the automatic rescue of the saturating gene-scale default at genome scale (see Real genome benchmarks below).</w:t>
+      </w:r>
+    </w:p>
+    <w:p>
+      <w:pPr>
+        <w:pStyle w:val="BodyText"/>
       </w:pPr>
       <w:r>
         <w:rPr>
@@ -3470,7 +3488,7 @@
               <w:pStyle w:val="Compact"/>
             </w:pPr>
             <w:r>
-              <w:t xml:space="preserve">Fusang better (indel; values from the 30-seed benchmark; the independent 112-seed benchmark yields p=0.052)</w:t>
+              <w:t xml:space="preserve">Fusang better (indel) ‡</w:t>
             </w:r>
           </w:p>
         </w:tc>
@@ -3624,7 +3642,7 @@
         <w:t xml:space="preserve"> </w:t>
       </w:r>
       <w:r>
-        <w:t xml:space="preserve">indicates that the simplified pipeline (direct k-mer→cosine→NJ) was used rather than DCM+EPA; the winner is still FastTree2 on clean data. See Supplementary Table S6 for complete n=1000 benchmark results (30 seeds, both clean and indel conditions).</w:t>
+        <w:t xml:space="preserve">indicates that the simplified pipeline (direct k-mer→cosine→NJ) was used rather than DCM+EPA; the winner is still FastTree2 on clean data. See Supplementary Table S6 for complete n=1000 benchmark results (30 seeds, both clean and indel conditions). ‡ Row values are from the 30-seed benchmark (seed set 70–99); the independent 112-seed benchmark (seeds 100–229, after outlier exclusion) yields p=0.052 (borderline, Table 3).</w:t>
       </w:r>
     </w:p>
     <w:p>
@@ -3922,7 +3940,7 @@
         <w:pStyle w:val="BodyText"/>
       </w:pPr>
       <w:r>
-        <w:t xml:space="preserve">P-values are from two-sided permutation tests comparing mean same-group versus different-group tree-based pairwise distances with taxonomic group labels permuted. Fusang recovers significant phylogenetic signal at order and phylum levels across 74 taxa. The expanded dataset (six phyla: Proteobacteria, Firmicutes, Actinobacteria, Bacteroidetes, Cyanobacteria, and others including Archaea) provides substantially greater statistical power than the earlier 16-taxa validation. Known sister pairs cluster within small monophyletic groups, and the overall tree topology recovers major phylum-level divisions.</w:t>
+        <w:t xml:space="preserve">P-values are from two-sided permutation tests comparing mean same-group versus different-group tree-based pairwise distances with taxonomic group labels permuted (test statistic: difference in group means; 10,000 random permutations per level). A verification rerun of these tests on the archived tree and metadata (which retain 73 of the 74 taxa) reproduces significant signal at both order and phylum levels (7.3% and 3.8% mean-distance reduction, p=0.027 and p=0.003); family-rank labels were not retained in the archived metadata, and the family row is reported from the original analysis. Fusang recovers significant phylogenetic signal at order and phylum levels across 74 taxa. The expanded dataset (six phyla: Proteobacteria, Firmicutes, Actinobacteria, Bacteroidetes, Cyanobacteria, and others including Archaea) provides substantially greater statistical power than the earlier 16-taxa validation. Known sister pairs cluster within small monophyletic groups, and the overall tree topology recovers major phylum-level divisions.</w:t>
       </w:r>
     </w:p>
     <w:p>
@@ -4946,7 +4964,7 @@
           <w:b/>
           <w:bCs/>
         </w:rPr>
-        <w:t xml:space="preserve">Table 12. Real genome benchmarks (AFproject community datasets, ETE3 nRF vs published reference trees). All methods use NJ on unaligned input unless noted.</w:t>
+        <w:t xml:space="preserve">Table 12. Real genome benchmarks (AFproject community datasets, ETE3 nRF¹ vs published reference trees). All methods use NJ on unaligned input unless noted.</w:t>
       </w:r>
     </w:p>
     <w:tbl>
@@ -5281,7 +5299,7 @@
               <w:jc w:val="center"/>
             </w:pPr>
             <w:r>
-              <w:t xml:space="preserve">— ³</w:t>
+              <w:t xml:space="preserve">n/a ³</w:t>
             </w:r>
           </w:p>
         </w:tc>
@@ -5501,7 +5519,31 @@
         <w:pStyle w:val="BodyText"/>
       </w:pPr>
       <w:r>
-        <w:t xml:space="preserve">¹ nRF computed with ETE3 Tree.compare (unrooted, informative splits only, max_rf = 2(n−3)) — the AFproject scoring standard; not numerically comparable with the internal nRF of Tables 1–11. Values in brackets are the scores published in the AFproject benchmark for the same method configuration; kmacs and Mash are original binaries and reproduce the published values (difference ≤ one split, attributable to the NJ implementation), cross-validating our pipeline. Co-phylog is our Python reimplementation (as in Table 7), which explains its slightly better-than-published fish score.</w:t>
+        <w:t xml:space="preserve">¹ nRF computed with ETE3 Tree.compare (unrooted, informative splits only, max_rf = 2(n−3)) — the AFproject scoring standard; not numerically comparable with the internal nRF of Tables 1–11.</w:t>
+      </w:r>
+      <w:r>
+        <w:t xml:space="preserve"> </w:t>
+      </w:r>
+      <w:r>
+        <w:t xml:space="preserve">“—”</w:t>
+      </w:r>
+      <w:r>
+        <w:t xml:space="preserve"> </w:t>
+      </w:r>
+      <w:r>
+        <w:t xml:space="preserve">= not tested (see notes);</w:t>
+      </w:r>
+      <w:r>
+        <w:t xml:space="preserve"> </w:t>
+      </w:r>
+      <w:r>
+        <w:t xml:space="preserve">“n/a”</w:t>
+      </w:r>
+      <w:r>
+        <w:t xml:space="preserve"> </w:t>
+      </w:r>
+      <w:r>
+        <w:t xml:space="preserve">= not applicable. Values in brackets are the scores published in the AFproject benchmark for the same method configuration; kmacs and Mash are original binaries and reproduce the published values (difference ≤ one split, consistent with NJ implementation differences), cross-validating the benchmark harness (data, NJ, and ETE3 scoring) rather than Fusang itself. Co-phylog is our Python reimplementation (as in Table 7), which explains its slightly better-than-published fish score.</w:t>
       </w:r>
       <w:r>
         <w:t xml:space="preserve"> </w:t>
@@ -5536,13 +5578,13 @@
           <w:b/>
           <w:bCs/>
         </w:rPr>
-        <w:t xml:space="preserve">On deep-divergence indel-rich real data, the multi-k cosine ensemble matches both MSA+ML and the best published alignment-free methods.</w:t>
+        <w:t xml:space="preserve">On deep-divergence indel-rich real data, the multi-k cosine ensemble reaches the community-benchmark ceiling.</w:t>
       </w:r>
       <w:r>
         <w:t xml:space="preserve"> </w:t>
       </w:r>
       <w:r>
-        <w:t xml:space="preserve">On the fish mitochondrial dataset (25 genomes across multiple orders, 9.1% alignment gaps), multi-k cosine achieves nRF=0.045 — identical to MAFFT+FastTree2 and to kmacs, Mash, and Co-phylog at their AFproject-published best configurations. With n=25 taxa (44 informative splits), 0.045 corresponds to a 2-split difference from the trusted tree. Notably, this is achieved without alignment (~15s total vs ~75s for MAFFT alone) and without any k selection.</w:t>
+        <w:t xml:space="preserve">On the fish mitochondrial dataset (25 genomes across multiple orders, 9.1% alignment gaps), multi-k cosine achieves nRF=0.045 — identical to MAFFT+FastTree2 and to kmacs, Mash, and Co-phylog at their AFproject-published best configurations. This dataset does not discriminate among these methods: with n=25 taxa (44 informative splits), 0.045 corresponds to a 2-split difference from the trusted tree, and all top methods converge at this floor. The evidential value is therefore not that the ensemble distinguishes itself from MSA+ML, but that an alignment-free method with no k selection and no alignment step (~15s total vs ~75s for MAFFT alone) reaches the community optimum on real deep-divergence indel-rich data.</w:t>
       </w:r>
     </w:p>
     <w:p>
@@ -5563,7 +5605,7 @@
         <w:t xml:space="preserve"> </w:t>
       </w:r>
       <w:r>
-        <w:t xml:space="preserve">The gene-scale default (k=5) saturates at genome scale (only 1,024 possible 5-mers over 17–4,600 kb of sequence), producing near-random trees (fish nRF=0.545; E. coli nRF=0.875). Single larger k values recover signal on fish (k=9: 0.091; k=11: 0.091), yet the multi-k average — which includes the saturated k=5 and k=7 matrices — still achieves the best result (0.045), because the informative scale-specific variation in the k=7–11 matrices dominates the topology while the ensemble averages out scale-specific noise. The multi-k ensemble thereby removes the need for length-aware k selection across a &gt;2,000-fold range of sequence lengths (500 bp genes to 17 kb mitogenomes).</w:t>
+        <w:t xml:space="preserve">The gene-scale default (k=5) saturates at genome scale (only 1,024 possible 5-mers over 17–4,600 kb of sequence), producing near-random trees (fish nRF=0.545; E. coli nRF=0.875). Single larger k values recover signal on fish (k=9: 0.091; k=11: 0.091), yet the multi-k average — which includes the saturated k=5 and k=7 matrices — still achieves the best result (0.045). A plausible but unverified mechanism (this is a single dataset, and the explanation is post hoc) is that the informative scale-specific variation in the k=7–11 matrices dominates the topology while the ensemble averages out scale-specific noise. The multi-k ensemble thereby removes the need for length-aware k selection across a &gt;2,000-fold range of sequence lengths (500 bp genes to 17 kb mitogenomes).</w:t>
       </w:r>
     </w:p>
     <w:p>

</xml_diff>